<commit_message>
Revise Assignment 9 CQ3 queries based on team feedback
</commit_message>
<xml_diff>
--- a/oe2026/tracking-cjf/CQAnswers/Matthew_CQ3_A9/OE_9_TeamCJF_CQ3_Report_Contributions_Matthew_FINAL.docx
+++ b/oe2026/tracking-cjf/CQAnswers/Matthew_CQ3_A9/OE_9_TeamCJF_CQ3_Report_Contributions_Matthew_FINAL.docx
@@ -28,7 +28,7 @@
           <w:color w:val="555D58"/>
           <w:sz w:val="18"/>
         </w:rPr>
-        <w:t>October 28, 2026  |  Protégé 5.6.9 · Snap SPARQL Query · HermiT</w:t>
+        <w:t>October 29, 2026  |  Protégé 5.6.9 · Snap SPARQL Query · HermiT</w:t>
       </w:r>
     </w:p>
     <w:p>
@@ -41,7 +41,7 @@
     </w:p>
     <w:p>
       <w:r>
-        <w:t>For CQ3, I reviewed the Assignment 9 ontology and the annotated sample individuals. No additional OWL axioms or individuals were necessary for my queries, so I made no new changes to the RDF ontology files this week. The existing Support and Challenge relationship individuals already connect conversation moves to Platform A, while the existing OWL property chains (makesSupports followed by isAimedAtSupports implies supports; makesChallenges followed by isAimedAtChallenges implies challenges) allow direct relationships to be inferred. I revised the CQ3 use-case documentation to match the tested SPARQL answers and to distinguish recorded state annotations from inferred relationships.</w:t>
+        <w:t>For my Assignment 9 CQ3 work, I updated the queries and documentation to match the regenerated sample individuals and the revised competency question. I did not add new OWL axioms or edit the team’s ontology. Existing Support and Challenge relationship individuals explicitly connect Claims and Issues to the Platform A Option; OWL property chains can additionally derive direct supports and challenges links. The new queries identify the current Supported status of Claims through their StateAssignment individuals, which is different from merely supporting an Option.</w:t>
       </w:r>
     </w:p>
     <w:p>
@@ -54,7 +54,7 @@
     </w:p>
     <w:p>
       <w:r>
-        <w:t>I learned how SPARQL can retrieve explicit relationships through relationship individuals, and how OWL property chains let the same question be answered through inferred direct properties. I also learned that a successful query result does not necessarily mean the result was inferred; the reasoner setting and the assertions in the data matter.</w:t>
+        <w:t>I learned that a Claim can support an Option without its own current state being Supported. For example, M0019 supports Platform A but is currently Unassessed. I also learned to retrieve readable conversation evidence by following the SIO_000206 property from a move to a TextSpan and reading its hasConversationText value.</w:t>
       </w:r>
     </w:p>
     <w:p>
@@ -67,7 +67,7 @@
     </w:p>
     <w:p>
       <w:r>
-        <w:t>The main difficulty was getting SPARQL to run reliably in Protégé. The standard SPARQL view failed to initialize because of a missing Java dependency, so I used the Snap SPARQL Query plugin instead. I also had to simplify the initial query because Snap rejected the VALUES clause. Later, queries against state assignments returned no rows until I selected Reasoner &gt; None for asserted-data retrieval. For reasoning-dependent queries, I started HermiT and checked the resulting answers separately.</w:t>
+        <w:t>The largest difficulty was adapting queries to the latest team data and Snap SPARQL syntax. The generated individuals changed their IRIs from the original OCT21_A-M#### pattern to CQSample/Move_OCT21_A-M####, and summaries were not stored as rdfs:comment on moves. I corrected the Option prefix and retrieved source utterances through their supporting text spans. I also had to distinguish a query returning seven text-span rows from six unique challenging moves, and ensure HermiT was active for the Supported-state queries.</w:t>
       </w:r>
     </w:p>
     <w:p>
@@ -80,7 +80,7 @@
     </w:p>
     <w:p>
       <w:r>
-        <w:t>CQ3 asks which Claims or Issues support or challenge Platform A and whether any Claims are contested. I used OE_8_TeamCJF_Individuals.rdf, which imports the OE_9_TeamCJF.rdf schema, with Platform A represented by OCT21_A-M0003. The asserted-data queries traverse the Support and Challenge relationship individuals to return six supporting Claims (M0004, M0008, M0018, M0019, M0038, M0060) and six challenging conversation moves (Issues M0010, M0014, M0050 and Claims M0013, M0015, M0016). A separate query retrieves Claim OCT21_A-M0023, its current state individual at Turn 12, and Issue OCT21_A-M0028 as the challenger. The state assignment's annotation records the reference state SupportedContested; that query does not itself establish an OWL-inferred SupportedContested classification. These queries require individual data; without the populated sample, the ontology alone cannot identify the specific contributions or their evidence.</w:t>
+        <w:t>CQ3 now asks which Claims or Issues support or challenge Platform A and which of those Claims are currently Supported. I tested against OE_9_TeamCJF_Individuals_CurrentStateAdded.rdf, importing OE_9_TeamCJF.rdf, with Platform A represented by CQSample/Move_OCT21_A-M0003. Explicit relationship queries retrieved six supporting Claims (M0004, M0008, M0018, M0019, M0038, M0060) and six distinct challenging moves: Claims M0013, M0015, M0016 and Issues M0010, M0014, M0050. The latter produced seven evidence rows because M0050 has two associated text spans. With HermiT active, five supporting Claims (M0004, M0008, M0018, M0038, M0060) and one challenging Claim (M0013) had current States classified Supported. M0019 remained Unassessed. These tests identify specific individuals and their source evidence, not merely class-level ontology constraints.</w:t>
       </w:r>
     </w:p>
     <w:p>
@@ -93,7 +93,7 @@
         <w:pStyle w:val="Heading1"/>
       </w:pPr>
       <w:r>
-        <w:t>CQ3 query testing evidence</w:t>
+        <w:t>CQ3 query testing evidence — regenerated Assignment 9 sample</w:t>
       </w:r>
     </w:p>
     <w:tbl>
@@ -117,14 +117,7 @@
             <w:shd w:fill="DCEBDD"/>
           </w:tcPr>
           <w:p>
-            <w:pPr>
-              <w:spacing w:after="0"/>
-            </w:pPr>
             <w:r>
-              <w:rPr>
-                <w:b/>
-                <w:sz w:val="16"/>
-              </w:rPr>
               <w:t>Query</w:t>
             </w:r>
           </w:p>
@@ -136,14 +129,7 @@
             <w:shd w:fill="DCEBDD"/>
           </w:tcPr>
           <w:p>
-            <w:pPr>
-              <w:spacing w:after="0"/>
-            </w:pPr>
             <w:r>
-              <w:rPr>
-                <w:b/>
-                <w:sz w:val="16"/>
-              </w:rPr>
               <w:t>Reasoner</w:t>
             </w:r>
           </w:p>
@@ -155,14 +141,7 @@
             <w:shd w:fill="DCEBDD"/>
           </w:tcPr>
           <w:p>
-            <w:pPr>
-              <w:spacing w:after="0"/>
-            </w:pPr>
             <w:r>
-              <w:rPr>
-                <w:b/>
-                <w:sz w:val="16"/>
-              </w:rPr>
               <w:t>Observed</w:t>
             </w:r>
           </w:p>
@@ -174,14 +153,7 @@
             <w:shd w:fill="DCEBDD"/>
           </w:tcPr>
           <w:p>
-            <w:pPr>
-              <w:spacing w:after="0"/>
-            </w:pPr>
             <w:r>
-              <w:rPr>
-                <w:b/>
-                <w:sz w:val="16"/>
-              </w:rPr>
               <w:t>Notes / sample IDs</w:t>
             </w:r>
           </w:p>
@@ -194,14 +166,8 @@
             <w:vAlign w:val="center"/>
           </w:tcPr>
           <w:p>
-            <w:pPr>
-              <w:spacing w:after="0"/>
-            </w:pPr>
             <w:r>
-              <w:rPr>
-                <w:sz w:val="16"/>
-              </w:rPr>
-              <w:t>A1 — asserted supports</w:t>
+              <w:t>A1 — supports</w:t>
             </w:r>
           </w:p>
         </w:tc>
@@ -211,13 +177,7 @@
             <w:vAlign w:val="center"/>
           </w:tcPr>
           <w:p>
-            <w:pPr>
-              <w:spacing w:after="0"/>
-            </w:pPr>
             <w:r>
-              <w:rPr>
-                <w:sz w:val="16"/>
-              </w:rPr>
               <w:t>None</w:t>
             </w:r>
           </w:p>
@@ -228,14 +188,8 @@
             <w:vAlign w:val="center"/>
           </w:tcPr>
           <w:p>
-            <w:pPr>
-              <w:spacing w:after="0"/>
-            </w:pPr>
             <w:r>
-              <w:rPr>
-                <w:sz w:val="16"/>
-              </w:rPr>
-              <w:t>6 Claims</w:t>
+              <w:t>6 rows / 6 Claims</w:t>
             </w:r>
           </w:p>
         </w:tc>
@@ -245,14 +199,8 @@
             <w:vAlign w:val="center"/>
           </w:tcPr>
           <w:p>
-            <w:pPr>
-              <w:spacing w:after="0"/>
-            </w:pPr>
             <w:r>
-              <w:rPr>
-                <w:sz w:val="16"/>
-              </w:rPr>
-              <w:t>M0004, M0008, M0018, M0019, M0038, M0060</w:t>
+              <w:t>M0004, M0008, M0018, M0019, M0038, M0060; text populated</w:t>
             </w:r>
           </w:p>
         </w:tc>
@@ -264,14 +212,8 @@
             <w:vAlign w:val="center"/>
           </w:tcPr>
           <w:p>
-            <w:pPr>
-              <w:spacing w:after="0"/>
-            </w:pPr>
             <w:r>
-              <w:rPr>
-                <w:sz w:val="16"/>
-              </w:rPr>
-              <w:t>A2 — asserted challenges</w:t>
+              <w:t>A2 — challenges</w:t>
             </w:r>
           </w:p>
         </w:tc>
@@ -281,13 +223,7 @@
             <w:vAlign w:val="center"/>
           </w:tcPr>
           <w:p>
-            <w:pPr>
-              <w:spacing w:after="0"/>
-            </w:pPr>
             <w:r>
-              <w:rPr>
-                <w:sz w:val="16"/>
-              </w:rPr>
               <w:t>None</w:t>
             </w:r>
           </w:p>
@@ -298,14 +234,8 @@
             <w:vAlign w:val="center"/>
           </w:tcPr>
           <w:p>
-            <w:pPr>
-              <w:spacing w:after="0"/>
-            </w:pPr>
             <w:r>
-              <w:rPr>
-                <w:sz w:val="16"/>
-              </w:rPr>
-              <w:t>6 moves</w:t>
+              <w:t>7 rows / 6 moves</w:t>
             </w:r>
           </w:p>
         </w:tc>
@@ -315,14 +245,8 @@
             <w:vAlign w:val="center"/>
           </w:tcPr>
           <w:p>
-            <w:pPr>
-              <w:spacing w:after="0"/>
-            </w:pPr>
             <w:r>
-              <w:rPr>
-                <w:sz w:val="16"/>
-              </w:rPr>
-              <w:t>M0010, M0013, M0014, M0015, M0016, M0050</w:t>
+              <w:t>M0010, M0013, M0014, M0015, M0016, M0050 (2 text spans)</w:t>
             </w:r>
           </w:p>
         </w:tc>
@@ -334,14 +258,8 @@
             <w:vAlign w:val="center"/>
           </w:tcPr>
           <w:p>
-            <w:pPr>
-              <w:spacing w:after="0"/>
-            </w:pPr>
             <w:r>
-              <w:rPr>
-                <w:sz w:val="16"/>
-              </w:rPr>
-              <w:t>B — recorded contested case</w:t>
+              <w:t>B1 — supporting Claims currently Supported</w:t>
             </w:r>
           </w:p>
         </w:tc>
@@ -351,14 +269,8 @@
             <w:vAlign w:val="center"/>
           </w:tcPr>
           <w:p>
-            <w:pPr>
-              <w:spacing w:after="0"/>
-            </w:pPr>
             <w:r>
-              <w:rPr>
-                <w:sz w:val="16"/>
-              </w:rPr>
-              <w:t>None</w:t>
+              <w:t>HermiT</w:t>
             </w:r>
           </w:p>
         </w:tc>
@@ -368,14 +280,8 @@
             <w:vAlign w:val="center"/>
           </w:tcPr>
           <w:p>
-            <w:pPr>
-              <w:spacing w:after="0"/>
-            </w:pPr>
             <w:r>
-              <w:rPr>
-                <w:sz w:val="16"/>
-              </w:rPr>
-              <w:t>1 Claim</w:t>
+              <w:t>5 Claims</w:t>
             </w:r>
           </w:p>
         </w:tc>
@@ -385,14 +291,8 @@
             <w:vAlign w:val="center"/>
           </w:tcPr>
           <w:p>
-            <w:pPr>
-              <w:spacing w:after="0"/>
-            </w:pPr>
             <w:r>
-              <w:rPr>
-                <w:sz w:val="16"/>
-              </w:rPr>
-              <w:t>M0023; current state at Turn 12; challenger M0028</w:t>
+              <w:t>M0004, M0008, M0018, M0038, M0060</w:t>
             </w:r>
           </w:p>
         </w:tc>
@@ -404,14 +304,8 @@
             <w:vAlign w:val="center"/>
           </w:tcPr>
           <w:p>
-            <w:pPr>
-              <w:spacing w:after="0"/>
-            </w:pPr>
             <w:r>
-              <w:rPr>
-                <w:sz w:val="16"/>
-              </w:rPr>
-              <w:t>C1 — direct supports</w:t>
+              <w:t>B2 — challenging Claims currently Supported</w:t>
             </w:r>
           </w:p>
         </w:tc>
@@ -421,14 +315,8 @@
             <w:vAlign w:val="center"/>
           </w:tcPr>
           <w:p>
-            <w:pPr>
-              <w:spacing w:after="0"/>
-            </w:pPr>
             <w:r>
-              <w:rPr>
-                <w:sz w:val="16"/>
-              </w:rPr>
-              <w:t>None / HermiT</w:t>
+              <w:t>HermiT</w:t>
             </w:r>
           </w:p>
         </w:tc>
@@ -438,14 +326,8 @@
             <w:vAlign w:val="center"/>
           </w:tcPr>
           <w:p>
-            <w:pPr>
-              <w:spacing w:after="0"/>
-            </w:pPr>
             <w:r>
-              <w:rPr>
-                <w:sz w:val="16"/>
-              </w:rPr>
-              <w:t>0 / 6</w:t>
+              <w:t>1 Claim</w:t>
             </w:r>
           </w:p>
         </w:tc>
@@ -455,14 +337,8 @@
             <w:vAlign w:val="center"/>
           </w:tcPr>
           <w:p>
-            <w:pPr>
-              <w:spacing w:after="0"/>
-            </w:pPr>
             <w:r>
-              <w:rPr>
-                <w:sz w:val="16"/>
-              </w:rPr>
-              <w:t>Property-chain entailment confirmed by comparison</w:t>
+              <w:t>M0013</w:t>
             </w:r>
           </w:p>
         </w:tc>
@@ -474,14 +350,8 @@
             <w:vAlign w:val="center"/>
           </w:tcPr>
           <w:p>
-            <w:pPr>
-              <w:spacing w:after="0"/>
-            </w:pPr>
             <w:r>
-              <w:rPr>
-                <w:sz w:val="16"/>
-              </w:rPr>
-              <w:t>C2 — direct challenges</w:t>
+              <w:t>Earlier C1 — direct supports</w:t>
             </w:r>
           </w:p>
         </w:tc>
@@ -491,14 +361,8 @@
             <w:vAlign w:val="center"/>
           </w:tcPr>
           <w:p>
-            <w:pPr>
-              <w:spacing w:after="0"/>
-            </w:pPr>
             <w:r>
-              <w:rPr>
-                <w:sz w:val="16"/>
-              </w:rPr>
-              <w:t>HermiT</w:t>
+              <w:t>None / HermiT</w:t>
             </w:r>
           </w:p>
         </w:tc>
@@ -508,14 +372,8 @@
             <w:vAlign w:val="center"/>
           </w:tcPr>
           <w:p>
-            <w:pPr>
-              <w:spacing w:after="0"/>
-            </w:pPr>
             <w:r>
-              <w:rPr>
-                <w:sz w:val="16"/>
-              </w:rPr>
-              <w:t>6 moves</w:t>
+              <w:t>0 / 6 previously</w:t>
             </w:r>
           </w:p>
         </w:tc>
@@ -525,14 +383,50 @@
             <w:vAlign w:val="center"/>
           </w:tcPr>
           <w:p>
-            <w:pPr>
-              <w:spacing w:after="0"/>
-            </w:pPr>
             <w:r>
-              <w:rPr>
-                <w:sz w:val="16"/>
-              </w:rPr>
-              <w:t>M0010, M0013, M0014, M0015, M0016, M0050</w:t>
+              <w:t>Previous individuals format; not yet re-tested on new data</w:t>
+            </w:r>
+          </w:p>
+        </w:tc>
+      </w:tr>
+      <w:tr>
+        <w:tc>
+          <w:tcPr>
+            <w:tcW w:type="dxa" w:w="2469"/>
+          </w:tcPr>
+          <w:p>
+            <w:r>
+              <w:t>Earlier C2 — direct challenges</w:t>
+            </w:r>
+          </w:p>
+        </w:tc>
+        <w:tc>
+          <w:tcPr>
+            <w:tcW w:type="dxa" w:w="2469"/>
+          </w:tcPr>
+          <w:p>
+            <w:r>
+              <w:t>HermiT</w:t>
+            </w:r>
+          </w:p>
+        </w:tc>
+        <w:tc>
+          <w:tcPr>
+            <w:tcW w:type="dxa" w:w="2469"/>
+          </w:tcPr>
+          <w:p>
+            <w:r>
+              <w:t>6 previously</w:t>
+            </w:r>
+          </w:p>
+        </w:tc>
+        <w:tc>
+          <w:tcPr>
+            <w:tcW w:type="dxa" w:w="2469"/>
+          </w:tcPr>
+          <w:p>
+            <w:r>
+              <w:t>Previous individuals format; not yet re-tested on new data</w:t>
             </w:r>
           </w:p>
         </w:tc>
@@ -546,11 +440,9 @@
         <w:rPr>
           <w:b/>
         </w:rPr>
-        <w:t>Interpretation:</w:t>
+        <w:t>Interpretation: A1/A2 retrieve explicitly recorded relationships and associated text. B1/B2 check the current State individual’s Supported classification while HermiT is active; we have not performed a None-versus-HermiT comparison for those state classifications. Earlier direct supports/challenges reasoning demonstrations used the previous individuals representation and must be re-tested with the new CQSample identifiers before being claimed as current-dataset results.</w:t>
       </w:r>
-      <w:r>
-        <w:t xml:space="preserve"> The six direct supports results appear only with HermiT active in the tested setup; this is evidence of OWL property-chain inference. Query B retrieves an annotated reference state, not an inferred state type. No separate repository hygiene or full regression-test result is claimed here.</w:t>
-      </w:r>
+      <w:r/>
     </w:p>
     <w:p>
       <w:pPr>
@@ -562,7 +454,7 @@
     </w:p>
     <w:p>
       <w:r>
-        <w:t>I used ChatGPT to help draft and revise the CQ3 SPARQL queries, inspect the ontology terminology, propose simpler query structures compatible with Snap SPARQL, and update the CQ3 use-case text. I checked the suggestions against the actual RDF data and tested the final queries in Protégé. Some initial guidance overlooked the Protégé reasoner setting, so I corrected the approach based on the tool output rather than treating the AI-generated queries as automatically verified.</w:t>
+        <w:t>I used ChatGPT to help draft and refine the CQ3 SPARQL queries and update the use case and report text. I tested the relevant queries in Protégé/Snap SPARQL, checked actual result counts, and corrected AI-suggested assumptions when they did not match the current file structure or the reviewer’s feedback.</w:t>
       </w:r>
     </w:p>
     <w:p>
@@ -575,7 +467,7 @@
     </w:p>
     <w:p>
       <w:r>
-        <w:t>Matthew Lausev: Developed and tested the CQ3 SPARQL queries, documented the asserted-versus-inferred results, and revised the CQ3 section of the Assignment 9 use case. I did not make new Assignment 9 ontology edits. Team-wide ontology changes, consolidated query files, and final merge/validation are handled through the team's review process.</w:t>
+        <w:t>Matthew Lausev: Revised and tested CQ3-A1/A2 to report move identifiers, types, and utterance text; revised and tested CQ3-B1/B2 to identify current Supported Claims among those linked to Platform A; and updated the CQ3 use case and report. Team-wide ontology changes and final integration remain the responsibility of the team. No new Assignment 9 ontology axioms or individual assertions were added as part of this CQ3 query revision.</w:t>
       </w:r>
     </w:p>
     <w:sectPr>

</xml_diff>